<commit_message>
added SSD in dialog box, updated SOP, added launchers for the secong training session
</commit_message>
<xml_diff>
--- a/docs/SEQ-DBS Training - Standard Operating Procedures.docx
+++ b/docs/SEQ-DBS Training - Standard Operating Procedures.docx
@@ -36,7 +36,7 @@
         <w:rPr>
           <w:rtl w:val="0"/>
         </w:rPr>
-        <w:t xml:space="preserve">This experiment was developed at the Guenther Lab at Boston University by Frank Guenther, Jennifer Segawa, Matt Masapollo, Andrew Meier, and Alan Bush. The Training phase of this experiment will be run remotely over Zoom and the Testing phase will be run in the EMU intraoperatively while subjects undergo awake DBS implantation surgery. For questions, contact Alan Bush at </w:t>
+        <w:t xml:space="preserve">This experiment was developed at the Guenther Lab at Boston University by Frank Guenther, Jennifer Segawa, Matt Masapollo, Andrew Meier, and Alan Bush. The Training phase of this experiment will be run remotely over Zoom and the Testing phase will be run in the OR intraoperatively while subjects undergo awake DBS implantation surgery. For questions, contact Alan Bush at </w:t>
       </w:r>
       <w:hyperlink r:id="rId7">
         <w:r>
@@ -98,14 +98,60 @@
         <w:rPr>
           <w:rtl w:val="0"/>
         </w:rPr>
-        <w:t xml:space="preserve">This is a speech motor learning experiment with a Training phase and a Test phase. In the first Training phase, which will be conducted remotely (Training I), monolingual English-speaking subjects will be trained to proficiently speak single-syllable nonwords which contain onset consonant clusters that are not native to English (e.g. ‘ZDAT’). Another shorter Training session will later be conducted in person on the morning of surgery (Training II). The Test phase will be conducted while subjects are undergoing awake surgery for DBS implantation. In this Test phase, subjects will produce their learned non-native syllables, as well as novel non-native syllables and nonword syllables with English-native consonant clusters (e.g. ‘BRUG’). All phases of this experiment will be experimenter-paced. </w:t>
-      </w:r>
-    </w:p>
-    <w:p>
-      <w:pPr>
-        <w:jc w:val="left"/>
-        <w:rPr/>
-      </w:pPr>
+        <w:t xml:space="preserve">This is a speech motor learning experiment with a Training phase and a Test phase. In the first Training phase, which will be conducted remotely (Training I), native English-speaking subjects will be trained to proficiently speak single-syllable nonwords which contain onset consonant clusters that are not native to English (e.g. ‘ZDAT’). Another shorter Training session will later be conducted in person on the morning of surgery (Training II). The Test phase will be conducted while subjects are undergoing awake surgery for DBS implantation. In this Test phase, subjects will produce their learned non-native syllables, as well as novel non-native syllables and nonword syllables with English-native consonant clusters (e.g. ‘BRUG’). All phases of this experiment will be experimenter-paced. There is an additional Familiarization phase to be run if necessary before the first training run. It includes stimuli not used for the phases and should be used to ensure that the participants have a good understanding of the task.  </w:t>
+      </w:r>
+    </w:p>
+    <w:p>
+      <w:pPr>
+        <w:jc w:val="left"/>
+        <w:rPr/>
+      </w:pPr>
+      <w:r>
+        <w:rPr>
+          <w:rtl w:val="0"/>
+        </w:rPr>
+      </w:r>
+    </w:p>
+    <w:p>
+      <w:pPr>
+        <w:pStyle w:val="Heading2"/>
+        <w:rPr/>
+      </w:pPr>
+      <w:bookmarkStart w:colFirst="0" w:colLast="0" w:name="_heading=h.qrshklarfkfo" w:id="0"/>
+      <w:bookmarkEnd w:id="0"/>
+      <w:r>
+        <w:rPr>
+          <w:rtl w:val="0"/>
+        </w:rPr>
+        <w:t xml:space="preserve">Instructions for participant:</w:t>
+      </w:r>
+    </w:p>
+    <w:p>
+      <w:pPr>
+        <w:jc w:val="left"/>
+        <w:rPr/>
+      </w:pPr>
+      <w:r>
+        <w:rPr>
+          <w:rtl w:val="0"/>
+        </w:rPr>
+      </w:r>
+    </w:p>
+    <w:p>
+      <w:pPr>
+        <w:jc w:val="left"/>
+        <w:rPr/>
+      </w:pPr>
+      <w:r>
+        <w:rPr>
+          <w:rFonts w:ascii="Roboto" w:cs="Roboto" w:eastAsia="Roboto" w:hAnsi="Roboto"/>
+          <w:sz w:val="23"/>
+          <w:szCs w:val="23"/>
+          <w:highlight w:val="white"/>
+          <w:rtl w:val="0"/>
+        </w:rPr>
+        <w:t xml:space="preserve">"In this experiment, you will hear a sound which is not an English word. That sound will also be spelled out on the screen. After you hear the beep, please repeat it aloud. Sometimes you will also hear a buzzer. If you hear the buzzer, stop saying whatever sound you are in the middle of saying. Try to say the exact sound you hear as quickly and accurately as possible. Please wait until you hear the beep to begin speaking." </w:t>
+      </w:r>
       <w:r>
         <w:rPr>
           <w:rtl w:val="0"/>
@@ -542,7 +588,30 @@
           <w:vertAlign w:val="baseline"/>
           <w:rtl w:val="0"/>
         </w:rPr>
-        <w:t xml:space="preserve">Matlab (2013b or newer) with the Psychtoolbox installed</w:t>
+        <w:t xml:space="preserve">Matlab (201</w:t>
+      </w:r>
+      <w:r>
+        <w:rPr>
+          <w:rtl w:val="0"/>
+        </w:rPr>
+        <w:t xml:space="preserve">9</w:t>
+      </w:r>
+      <w:r>
+        <w:rPr>
+          <w:rFonts w:ascii="Cambria" w:cs="Cambria" w:eastAsia="Cambria" w:hAnsi="Cambria"/>
+          <w:b w:val="0"/>
+          <w:i w:val="0"/>
+          <w:smallCaps w:val="0"/>
+          <w:strike w:val="0"/>
+          <w:color w:val="00000a"/>
+          <w:sz w:val="24"/>
+          <w:szCs w:val="24"/>
+          <w:u w:val="none"/>
+          <w:shd w:fill="auto" w:val="clear"/>
+          <w:vertAlign w:val="baseline"/>
+          <w:rtl w:val="0"/>
+        </w:rPr>
+        <w:t xml:space="preserve">b or newer) with the Psychtoolbox installed</w:t>
       </w:r>
     </w:p>
     <w:p>
@@ -569,20 +638,63 @@
       </w:pPr>
       <w:r>
         <w:rPr>
-          <w:rFonts w:ascii="Cambria" w:cs="Cambria" w:eastAsia="Cambria" w:hAnsi="Cambria"/>
-          <w:b w:val="0"/>
-          <w:i w:val="0"/>
-          <w:smallCaps w:val="0"/>
-          <w:strike w:val="0"/>
-          <w:color w:val="00000a"/>
-          <w:sz w:val="24"/>
-          <w:szCs w:val="24"/>
-          <w:u w:val="none"/>
-          <w:shd w:fill="auto" w:val="clear"/>
-          <w:vertAlign w:val="baseline"/>
-          <w:rtl w:val="0"/>
-        </w:rPr>
-        <w:t xml:space="preserve">All SEQ-DBS stimulus scripts and audio stimulus files added to the Matlab path</w:t>
+          <w:rtl w:val="0"/>
+        </w:rPr>
+        <w:t xml:space="preserve">Task </w:t>
+      </w:r>
+      <w:r>
+        <w:rPr>
+          <w:rFonts w:ascii="Cambria" w:cs="Cambria" w:eastAsia="Cambria" w:hAnsi="Cambria"/>
+          <w:b w:val="0"/>
+          <w:i w:val="0"/>
+          <w:smallCaps w:val="0"/>
+          <w:strike w:val="0"/>
+          <w:color w:val="00000a"/>
+          <w:sz w:val="24"/>
+          <w:szCs w:val="24"/>
+          <w:u w:val="none"/>
+          <w:shd w:fill="auto" w:val="clear"/>
+          <w:vertAlign w:val="baseline"/>
+          <w:rtl w:val="0"/>
+        </w:rPr>
+        <w:t xml:space="preserve">scripts and audio stimulus files </w:t>
+      </w:r>
+      <w:r>
+        <w:rPr>
+          <w:rtl w:val="0"/>
+        </w:rPr>
+        <w:t xml:space="preserve">(github.com/Brain-Modulation-Lab/Task_SpeechMotorSequenceLearning)</w:t>
+      </w:r>
+    </w:p>
+    <w:p>
+      <w:pPr>
+        <w:keepNext w:val="0"/>
+        <w:keepLines w:val="0"/>
+        <w:widowControl w:val="1"/>
+        <w:numPr>
+          <w:ilvl w:val="1"/>
+          <w:numId w:val="1"/>
+        </w:numPr>
+        <w:pBdr>
+          <w:top w:space="0" w:sz="0" w:val="nil"/>
+          <w:left w:space="0" w:sz="0" w:val="nil"/>
+          <w:bottom w:space="0" w:sz="0" w:val="nil"/>
+          <w:right w:space="0" w:sz="0" w:val="nil"/>
+          <w:between w:space="0" w:sz="0" w:val="nil"/>
+        </w:pBdr>
+        <w:shd w:fill="auto" w:val="clear"/>
+        <w:spacing w:after="0" w:before="0" w:line="240" w:lineRule="auto"/>
+        <w:ind w:left="1440" w:right="0" w:hanging="360"/>
+        <w:jc w:val="left"/>
+        <w:rPr>
+          <w:u w:val="none"/>
+        </w:rPr>
+      </w:pPr>
+      <w:r>
+        <w:rPr>
+          <w:rtl w:val="0"/>
+        </w:rPr>
+        <w:t xml:space="preserve">An external audio recorder cable cable of acquiring the audio output from the experimenter computer. (This will be used as backup if the Zoom recording fails). </w:t>
       </w:r>
     </w:p>
     <w:p>
@@ -605,16 +717,18 @@
         <w:spacing w:after="0" w:before="0" w:line="240" w:lineRule="auto"/>
         <w:ind w:left="720" w:right="0" w:hanging="360"/>
         <w:jc w:val="left"/>
-        <w:rPr/>
-      </w:pPr>
-      <w:r>
-        <w:rPr>
-          <w:rFonts w:ascii="Cambria" w:cs="Cambria" w:eastAsia="Cambria" w:hAnsi="Cambria"/>
-          <w:b w:val="0"/>
-          <w:i w:val="0"/>
-          <w:smallCaps w:val="0"/>
-          <w:strike w:val="0"/>
-          <w:color w:val="00000a"/>
+        <w:rPr>
+          <w:color w:val="999999"/>
+        </w:rPr>
+      </w:pPr>
+      <w:r>
+        <w:rPr>
+          <w:rFonts w:ascii="Cambria" w:cs="Cambria" w:eastAsia="Cambria" w:hAnsi="Cambria"/>
+          <w:b w:val="0"/>
+          <w:i w:val="0"/>
+          <w:smallCaps w:val="0"/>
+          <w:strike w:val="0"/>
+          <w:color w:val="999999"/>
           <w:sz w:val="24"/>
           <w:szCs w:val="24"/>
           <w:u w:val="none"/>
@@ -645,16 +759,18 @@
         <w:spacing w:after="0" w:before="0" w:line="240" w:lineRule="auto"/>
         <w:ind w:left="1530" w:right="0" w:hanging="180"/>
         <w:jc w:val="left"/>
-        <w:rPr/>
-      </w:pPr>
-      <w:r>
-        <w:rPr>
-          <w:rFonts w:ascii="Cambria" w:cs="Cambria" w:eastAsia="Cambria" w:hAnsi="Cambria"/>
-          <w:b w:val="0"/>
-          <w:i w:val="0"/>
-          <w:smallCaps w:val="0"/>
-          <w:strike w:val="0"/>
-          <w:color w:val="00000a"/>
+        <w:rPr>
+          <w:color w:val="999999"/>
+        </w:rPr>
+      </w:pPr>
+      <w:r>
+        <w:rPr>
+          <w:rFonts w:ascii="Cambria" w:cs="Cambria" w:eastAsia="Cambria" w:hAnsi="Cambria"/>
+          <w:b w:val="0"/>
+          <w:i w:val="0"/>
+          <w:smallCaps w:val="0"/>
+          <w:strike w:val="0"/>
+          <w:color w:val="999999"/>
           <w:sz w:val="24"/>
           <w:szCs w:val="24"/>
           <w:u w:val="none"/>
@@ -685,16 +801,18 @@
         <w:spacing w:after="0" w:before="0" w:line="240" w:lineRule="auto"/>
         <w:ind w:left="1530" w:right="0" w:hanging="180"/>
         <w:jc w:val="left"/>
-        <w:rPr/>
-      </w:pPr>
-      <w:r>
-        <w:rPr>
-          <w:rFonts w:ascii="Cambria" w:cs="Cambria" w:eastAsia="Cambria" w:hAnsi="Cambria"/>
-          <w:b w:val="0"/>
-          <w:i w:val="0"/>
-          <w:smallCaps w:val="0"/>
-          <w:strike w:val="0"/>
-          <w:color w:val="00000a"/>
+        <w:rPr>
+          <w:color w:val="999999"/>
+        </w:rPr>
+      </w:pPr>
+      <w:r>
+        <w:rPr>
+          <w:rFonts w:ascii="Cambria" w:cs="Cambria" w:eastAsia="Cambria" w:hAnsi="Cambria"/>
+          <w:b w:val="0"/>
+          <w:i w:val="0"/>
+          <w:smallCaps w:val="0"/>
+          <w:strike w:val="0"/>
+          <w:color w:val="999999"/>
           <w:sz w:val="24"/>
           <w:szCs w:val="24"/>
           <w:u w:val="none"/>
@@ -725,16 +843,18 @@
         <w:spacing w:after="0" w:before="0" w:line="240" w:lineRule="auto"/>
         <w:ind w:left="1530" w:right="0" w:hanging="180"/>
         <w:jc w:val="left"/>
-        <w:rPr/>
-      </w:pPr>
-      <w:r>
-        <w:rPr>
-          <w:rFonts w:ascii="Cambria" w:cs="Cambria" w:eastAsia="Cambria" w:hAnsi="Cambria"/>
-          <w:b w:val="0"/>
-          <w:i w:val="0"/>
-          <w:smallCaps w:val="0"/>
-          <w:strike w:val="0"/>
-          <w:color w:val="00000a"/>
+        <w:rPr>
+          <w:color w:val="999999"/>
+        </w:rPr>
+      </w:pPr>
+      <w:r>
+        <w:rPr>
+          <w:rFonts w:ascii="Cambria" w:cs="Cambria" w:eastAsia="Cambria" w:hAnsi="Cambria"/>
+          <w:b w:val="0"/>
+          <w:i w:val="0"/>
+          <w:smallCaps w:val="0"/>
+          <w:strike w:val="0"/>
+          <w:color w:val="999999"/>
           <w:sz w:val="24"/>
           <w:szCs w:val="24"/>
           <w:u w:val="none"/>
@@ -765,16 +885,18 @@
         <w:spacing w:after="0" w:before="0" w:line="240" w:lineRule="auto"/>
         <w:ind w:left="1530" w:right="0" w:hanging="180"/>
         <w:jc w:val="left"/>
-        <w:rPr/>
-      </w:pPr>
-      <w:r>
-        <w:rPr>
-          <w:rFonts w:ascii="Cambria" w:cs="Cambria" w:eastAsia="Cambria" w:hAnsi="Cambria"/>
-          <w:b w:val="0"/>
-          <w:i w:val="0"/>
-          <w:smallCaps w:val="0"/>
-          <w:strike w:val="0"/>
-          <w:color w:val="00000a"/>
+        <w:rPr>
+          <w:color w:val="999999"/>
+        </w:rPr>
+      </w:pPr>
+      <w:r>
+        <w:rPr>
+          <w:rFonts w:ascii="Cambria" w:cs="Cambria" w:eastAsia="Cambria" w:hAnsi="Cambria"/>
+          <w:b w:val="0"/>
+          <w:i w:val="0"/>
+          <w:smallCaps w:val="0"/>
+          <w:strike w:val="0"/>
+          <w:color w:val="999999"/>
           <w:sz w:val="24"/>
           <w:szCs w:val="24"/>
           <w:u w:val="none"/>
@@ -847,10 +969,10 @@
         </w:rPr>
       </w:r>
     </w:p>
-    <w:bookmarkStart w:colFirst="0" w:colLast="0" w:name="bookmark=id.30j0zll" w:id="0"/>
-    <w:bookmarkEnd w:id="0"/>
-    <w:bookmarkStart w:colFirst="0" w:colLast="0" w:name="bookmark=id.gjdgxs" w:id="1"/>
+    <w:bookmarkStart w:colFirst="0" w:colLast="0" w:name="bookmark=id.30j0zll" w:id="1"/>
     <w:bookmarkEnd w:id="1"/>
+    <w:bookmarkStart w:colFirst="0" w:colLast="0" w:name="bookmark=id.gjdgxs" w:id="2"/>
+    <w:bookmarkEnd w:id="2"/>
     <w:p>
       <w:pPr>
         <w:pStyle w:val="Heading2"/>
@@ -910,7 +1032,18 @@
           <w:vertAlign w:val="baseline"/>
           <w:rtl w:val="0"/>
         </w:rPr>
-        <w:t xml:space="preserve">Open Matlab and make sure that the directories containing stimulus scripts and audio stimulus files are on the path</w:t>
+        <w:t xml:space="preserve">Open Matlab and </w:t>
+      </w:r>
+      <w:r>
+        <w:rPr>
+          <w:rtl w:val="0"/>
+        </w:rPr>
+        <w:t xml:space="preserve">in the directory containing the launcher scripts (START_SMLS_{phase}.m)</w:t>
+      </w:r>
+      <w:r>
+        <w:rPr>
+          <w:rtl w:val="0"/>
+        </w:rPr>
       </w:r>
     </w:p>
     <w:p>
@@ -1017,20 +1150,49 @@
       </w:pPr>
       <w:r>
         <w:rPr>
-          <w:rFonts w:ascii="Cambria" w:cs="Cambria" w:eastAsia="Cambria" w:hAnsi="Cambria"/>
-          <w:b w:val="0"/>
-          <w:i w:val="0"/>
-          <w:smallCaps w:val="0"/>
-          <w:strike w:val="0"/>
-          <w:color w:val="00000a"/>
-          <w:sz w:val="24"/>
-          <w:szCs w:val="24"/>
-          <w:u w:val="none"/>
-          <w:shd w:fill="auto" w:val="clear"/>
-          <w:vertAlign w:val="baseline"/>
-          <w:rtl w:val="0"/>
-        </w:rPr>
-        <w:t xml:space="preserve">check ‘Record video during screen sharing’</w:t>
+          <w:rtl w:val="0"/>
+        </w:rPr>
+        <w:t xml:space="preserve">un</w:t>
+      </w:r>
+      <w:r>
+        <w:rPr>
+          <w:rFonts w:ascii="Cambria" w:cs="Cambria" w:eastAsia="Cambria" w:hAnsi="Cambria"/>
+          <w:b w:val="0"/>
+          <w:i w:val="0"/>
+          <w:smallCaps w:val="0"/>
+          <w:strike w:val="0"/>
+          <w:color w:val="00000a"/>
+          <w:sz w:val="24"/>
+          <w:szCs w:val="24"/>
+          <w:u w:val="none"/>
+          <w:shd w:fill="auto" w:val="clear"/>
+          <w:vertAlign w:val="baseline"/>
+          <w:rtl w:val="0"/>
+        </w:rPr>
+        <w:t xml:space="preserve">check ‘Record video during screen sharing’ (would need IRB AME to acqui</w:t>
+      </w:r>
+      <w:r>
+        <w:rPr>
+          <w:rtl w:val="0"/>
+        </w:rPr>
+        <w:t xml:space="preserve">re video </w:t>
+      </w:r>
+      <w:r>
+        <w:rPr>
+          <w:rFonts w:ascii="Cambria" w:cs="Cambria" w:eastAsia="Cambria" w:hAnsi="Cambria"/>
+          <w:b w:val="0"/>
+          <w:i w:val="0"/>
+          <w:smallCaps w:val="0"/>
+          <w:strike w:val="0"/>
+          <w:color w:val="00000a"/>
+          <w:sz w:val="24"/>
+          <w:szCs w:val="24"/>
+          <w:u w:val="none"/>
+          <w:shd w:fill="auto" w:val="clear"/>
+          <w:vertAlign w:val="baseline"/>
+          <w:rtl w:val="0"/>
+        </w:rPr>
+        <w:t xml:space="preserve">recordings)</w:t>
       </w:r>
     </w:p>
     <w:p>
@@ -1150,7 +1312,53 @@
           <w:vertAlign w:val="baseline"/>
           <w:rtl w:val="0"/>
         </w:rPr>
-        <w:t xml:space="preserve">On Mac, click the apple sign in the top left corner of the screen. </w:t>
+        <w:t xml:space="preserve">On Mac, click </w:t>
+      </w:r>
+      <w:r>
+        <w:rPr>
+          <w:rtl w:val="0"/>
+        </w:rPr>
+        <w:t xml:space="preserve">on</w:t>
+      </w:r>
+      <w:r>
+        <w:rPr>
+          <w:rFonts w:ascii="Cambria" w:cs="Cambria" w:eastAsia="Cambria" w:hAnsi="Cambria"/>
+          <w:b w:val="0"/>
+          <w:i w:val="0"/>
+          <w:smallCaps w:val="0"/>
+          <w:strike w:val="0"/>
+          <w:color w:val="00000a"/>
+          <w:sz w:val="24"/>
+          <w:szCs w:val="24"/>
+          <w:u w:val="none"/>
+          <w:shd w:fill="auto" w:val="clear"/>
+          <w:vertAlign w:val="baseline"/>
+          <w:rtl w:val="0"/>
+        </w:rPr>
+        <w:t xml:space="preserve"> "zoom.us" on the menu bar to the right of the apple sign, in the top left corner of the screen. Select "preferences</w:t>
+      </w:r>
+      <w:r>
+        <w:rPr>
+          <w:rtl w:val="0"/>
+        </w:rPr>
+        <w:t xml:space="preserve">…</w:t>
+      </w:r>
+      <w:r>
+        <w:rPr>
+          <w:rFonts w:ascii="Cambria" w:cs="Cambria" w:eastAsia="Cambria" w:hAnsi="Cambria"/>
+          <w:b w:val="0"/>
+          <w:i w:val="0"/>
+          <w:smallCaps w:val="0"/>
+          <w:strike w:val="0"/>
+          <w:color w:val="00000a"/>
+          <w:sz w:val="24"/>
+          <w:szCs w:val="24"/>
+          <w:u w:val="none"/>
+          <w:shd w:fill="auto" w:val="clear"/>
+          <w:vertAlign w:val="baseline"/>
+          <w:rtl w:val="0"/>
+        </w:rPr>
+        <w:t xml:space="preserve">".</w:t>
       </w:r>
     </w:p>
     <w:p>
@@ -1277,12 +1485,12 @@
           <wp:inline distB="0" distT="0" distL="0" distR="0">
             <wp:extent cx="1838325" cy="742950"/>
             <wp:effectExtent b="0" l="0" r="0" t="0"/>
-            <wp:docPr id="13" name="image1.png"/>
+            <wp:docPr id="13" name="image6.png"/>
             <a:graphic>
               <a:graphicData uri="http://schemas.openxmlformats.org/drawingml/2006/picture">
                 <pic:pic>
                   <pic:nvPicPr>
-                    <pic:cNvPr id="0" name="image1.png"/>
+                    <pic:cNvPr id="0" name="image6.png"/>
                     <pic:cNvPicPr preferRelativeResize="0"/>
                   </pic:nvPicPr>
                   <pic:blipFill>
@@ -1374,12 +1582,12 @@
           <wp:inline distB="0" distT="0" distL="0" distR="0">
             <wp:extent cx="2209800" cy="1447800"/>
             <wp:effectExtent b="0" l="0" r="0" t="0"/>
-            <wp:docPr id="15" name="image2.png"/>
+            <wp:docPr id="15" name="image1.png"/>
             <a:graphic>
               <a:graphicData uri="http://schemas.openxmlformats.org/drawingml/2006/picture">
                 <pic:pic>
                   <pic:nvPicPr>
-                    <pic:cNvPr id="0" name="image2.png"/>
+                    <pic:cNvPr id="0" name="image1.png"/>
                     <pic:cNvPicPr preferRelativeResize="0"/>
                   </pic:nvPicPr>
                   <pic:blipFill>
@@ -1854,7 +2062,18 @@
           <w:vertAlign w:val="baseline"/>
           <w:rtl w:val="0"/>
         </w:rPr>
-        <w:t xml:space="preserve">---check ‘Echo cancellation’</w:t>
+        <w:t xml:space="preserve">---check ‘Echo cancellation’ (this is counter intuitive, but this wil</w:t>
+      </w:r>
+      <w:r>
+        <w:rPr>
+          <w:rtl w:val="0"/>
+        </w:rPr>
+        <w:t xml:space="preserve">l disable echo cancelling. Read tooltip text.) </w:t>
+      </w:r>
+      <w:r>
+        <w:rPr>
+          <w:rtl w:val="0"/>
+        </w:rPr>
       </w:r>
     </w:p>
     <w:p>
@@ -1920,12 +2139,12 @@
           <wp:inline distB="0" distT="0" distL="0" distR="0">
             <wp:extent cx="2533650" cy="1085850"/>
             <wp:effectExtent b="0" l="0" r="0" t="0"/>
-            <wp:docPr id="14" name="image7.png"/>
+            <wp:docPr id="14" name="image4.png"/>
             <a:graphic>
               <a:graphicData uri="http://schemas.openxmlformats.org/drawingml/2006/picture">
                 <pic:pic>
                   <pic:nvPicPr>
-                    <pic:cNvPr id="0" name="image7.png"/>
+                    <pic:cNvPr id="0" name="image4.png"/>
                     <pic:cNvPicPr preferRelativeResize="0"/>
                   </pic:nvPicPr>
                   <pic:blipFill>
@@ -2069,12 +2288,12 @@
           <wp:inline distB="0" distT="0" distL="0" distR="0">
             <wp:extent cx="4495800" cy="1162050"/>
             <wp:effectExtent b="0" l="0" r="0" t="0"/>
-            <wp:docPr id="17" name="image8.png"/>
+            <wp:docPr id="17" name="image7.png"/>
             <a:graphic>
               <a:graphicData uri="http://schemas.openxmlformats.org/drawingml/2006/picture">
                 <pic:pic>
                   <pic:nvPicPr>
-                    <pic:cNvPr id="0" name="image8.png"/>
+                    <pic:cNvPr id="0" name="image7.png"/>
                     <pic:cNvPicPr preferRelativeResize="0"/>
                   </pic:nvPicPr>
                   <pic:blipFill>
@@ -2179,12 +2398,12 @@
           <wp:inline distB="0" distT="0" distL="0" distR="0">
             <wp:extent cx="2905125" cy="1247775"/>
             <wp:effectExtent b="0" l="0" r="0" t="0"/>
-            <wp:docPr id="16" name="image9.png"/>
+            <wp:docPr id="16" name="image3.png"/>
             <a:graphic>
               <a:graphicData uri="http://schemas.openxmlformats.org/drawingml/2006/picture">
                 <pic:pic>
                   <pic:nvPicPr>
-                    <pic:cNvPr id="0" name="image9.png"/>
+                    <pic:cNvPr id="0" name="image3.png"/>
                     <pic:cNvPicPr preferRelativeResize="0"/>
                   </pic:nvPicPr>
                   <pic:blipFill>
@@ -2293,12 +2512,12 @@
           <wp:inline distB="0" distT="0" distL="0" distR="0">
             <wp:extent cx="5943600" cy="1005840"/>
             <wp:effectExtent b="0" l="0" r="0" t="0"/>
-            <wp:docPr id="19" name="image3.png"/>
+            <wp:docPr id="19" name="image2.png"/>
             <a:graphic>
               <a:graphicData uri="http://schemas.openxmlformats.org/drawingml/2006/picture">
                 <pic:pic>
                   <pic:nvPicPr>
-                    <pic:cNvPr id="0" name="image3.png"/>
+                    <pic:cNvPr id="0" name="image2.png"/>
                     <pic:cNvPicPr preferRelativeResize="0"/>
                   </pic:nvPicPr>
                   <pic:blipFill>
@@ -2380,12 +2599,12 @@
           <wp:inline distB="0" distT="0" distL="0" distR="0">
             <wp:extent cx="2438400" cy="590550"/>
             <wp:effectExtent b="0" l="0" r="0" t="0"/>
-            <wp:docPr id="18" name="image5.png"/>
+            <wp:docPr id="18" name="image8.png"/>
             <a:graphic>
               <a:graphicData uri="http://schemas.openxmlformats.org/drawingml/2006/picture">
                 <pic:pic>
                   <pic:nvPicPr>
-                    <pic:cNvPr id="0" name="image5.png"/>
+                    <pic:cNvPr id="0" name="image8.png"/>
                     <pic:cNvPicPr preferRelativeResize="0"/>
                   </pic:nvPicPr>
                   <pic:blipFill>
@@ -2450,20 +2669,33 @@
       </w:pPr>
       <w:r>
         <w:rPr>
-          <w:rFonts w:ascii="Cambria" w:cs="Cambria" w:eastAsia="Cambria" w:hAnsi="Cambria"/>
-          <w:b w:val="0"/>
-          <w:i w:val="0"/>
-          <w:smallCaps w:val="0"/>
-          <w:strike w:val="0"/>
-          <w:color w:val="00000a"/>
-          <w:sz w:val="24"/>
-          <w:szCs w:val="24"/>
-          <w:u w:val="none"/>
-          <w:shd w:fill="auto" w:val="clear"/>
-          <w:vertAlign w:val="baseline"/>
-          <w:rtl w:val="0"/>
-        </w:rPr>
-        <w:t xml:space="preserve">Enter SEQRun_DBS on the Matlab command line to start the stimulus presentation function. The following prompt will appear: </w:t>
+          <w:rtl w:val="0"/>
+        </w:rPr>
+        <w:t xml:space="preserve">Give the following instructions to the participant:</w:t>
+      </w:r>
+    </w:p>
+    <w:p>
+      <w:pPr>
+        <w:keepNext w:val="0"/>
+        <w:keepLines w:val="0"/>
+        <w:widowControl w:val="1"/>
+        <w:pBdr>
+          <w:top w:space="0" w:sz="0" w:val="nil"/>
+          <w:left w:space="0" w:sz="0" w:val="nil"/>
+          <w:bottom w:space="0" w:sz="0" w:val="nil"/>
+          <w:right w:space="0" w:sz="0" w:val="nil"/>
+          <w:between w:space="0" w:sz="0" w:val="nil"/>
+        </w:pBdr>
+        <w:shd w:fill="auto" w:val="clear"/>
+        <w:spacing w:after="0" w:before="0" w:line="240" w:lineRule="auto"/>
+        <w:ind w:right="0"/>
+        <w:jc w:val="left"/>
+        <w:rPr/>
+      </w:pPr>
+      <w:r>
+        <w:rPr>
+          <w:rtl w:val="0"/>
+        </w:rPr>
       </w:r>
     </w:p>
     <w:p>
@@ -2482,24 +2714,114 @@
         <w:spacing w:after="0" w:before="0" w:line="240" w:lineRule="auto"/>
         <w:ind w:left="720" w:right="0" w:firstLine="0"/>
         <w:jc w:val="left"/>
-        <w:rPr>
-          <w:rFonts w:ascii="Cambria" w:cs="Cambria" w:eastAsia="Cambria" w:hAnsi="Cambria"/>
-          <w:b w:val="0"/>
-          <w:i w:val="0"/>
-          <w:smallCaps w:val="0"/>
-          <w:strike w:val="0"/>
-          <w:color w:val="00000a"/>
-          <w:sz w:val="24"/>
-          <w:szCs w:val="24"/>
-          <w:u w:val="none"/>
-          <w:shd w:fill="auto" w:val="clear"/>
-          <w:vertAlign w:val="baseline"/>
-        </w:rPr>
-      </w:pPr>
-      <w:r>
-        <w:rPr>
-          <w:rtl w:val="0"/>
-        </w:rPr>
+        <w:rPr/>
+      </w:pPr>
+      <w:r>
+        <w:rPr>
+          <w:rtl w:val="0"/>
+        </w:rPr>
+        <w:t xml:space="preserve">In this experiment, you will hear a sound which is not an English word. That sound will also be spelled out on the screen. After you hear the beep, please </w:t>
+      </w:r>
+      <w:r>
+        <w:rPr>
+          <w:b w:val="1"/>
+          <w:rtl w:val="0"/>
+        </w:rPr>
+        <w:t xml:space="preserve">repeat it aloud</w:t>
+      </w:r>
+      <w:r>
+        <w:rPr>
+          <w:rtl w:val="0"/>
+        </w:rPr>
+        <w:t xml:space="preserve">. Sometimes you will also hear a buzzer. If you hear the buzzer, stop saying whatever sound you were in the middle of saying. Try to say the exact sound you hear as quickly as possible. Please </w:t>
+      </w:r>
+      <w:r>
+        <w:rPr>
+          <w:b w:val="1"/>
+          <w:rtl w:val="0"/>
+        </w:rPr>
+        <w:t xml:space="preserve">wait until you hear the beep</w:t>
+      </w:r>
+      <w:r>
+        <w:rPr>
+          <w:rtl w:val="0"/>
+        </w:rPr>
+        <w:t xml:space="preserve"> to begin speaking. </w:t>
+      </w:r>
+      <w:r>
+        <w:rPr>
+          <w:rtl w:val="0"/>
+        </w:rPr>
+      </w:r>
+    </w:p>
+    <w:p>
+      <w:pPr>
+        <w:keepNext w:val="0"/>
+        <w:keepLines w:val="0"/>
+        <w:widowControl w:val="1"/>
+        <w:pBdr>
+          <w:top w:space="0" w:sz="0" w:val="nil"/>
+          <w:left w:space="0" w:sz="0" w:val="nil"/>
+          <w:bottom w:space="0" w:sz="0" w:val="nil"/>
+          <w:right w:space="0" w:sz="0" w:val="nil"/>
+          <w:between w:space="0" w:sz="0" w:val="nil"/>
+        </w:pBdr>
+        <w:shd w:fill="auto" w:val="clear"/>
+        <w:spacing w:after="0" w:before="0" w:line="240" w:lineRule="auto"/>
+        <w:ind w:right="0"/>
+        <w:jc w:val="left"/>
+        <w:rPr/>
+      </w:pPr>
+      <w:r>
+        <w:rPr>
+          <w:rtl w:val="0"/>
+        </w:rPr>
+      </w:r>
+    </w:p>
+    <w:p>
+      <w:pPr>
+        <w:keepNext w:val="0"/>
+        <w:keepLines w:val="0"/>
+        <w:widowControl w:val="1"/>
+        <w:numPr>
+          <w:ilvl w:val="0"/>
+          <w:numId w:val="2"/>
+        </w:numPr>
+        <w:pBdr>
+          <w:top w:space="0" w:sz="0" w:val="nil"/>
+          <w:left w:space="0" w:sz="0" w:val="nil"/>
+          <w:bottom w:space="0" w:sz="0" w:val="nil"/>
+          <w:right w:space="0" w:sz="0" w:val="nil"/>
+          <w:between w:space="0" w:sz="0" w:val="nil"/>
+        </w:pBdr>
+        <w:shd w:fill="auto" w:val="clear"/>
+        <w:spacing w:after="0" w:before="0" w:line="240" w:lineRule="auto"/>
+        <w:ind w:left="720" w:right="0" w:hanging="360"/>
+        <w:jc w:val="left"/>
+        <w:rPr/>
+      </w:pPr>
+      <w:r>
+        <w:rPr>
+          <w:rtl w:val="0"/>
+        </w:rPr>
+        <w:t xml:space="preserve">Run STAR_SMSL_{phase}.m i</w:t>
+      </w:r>
+      <w:r>
+        <w:rPr>
+          <w:rFonts w:ascii="Cambria" w:cs="Cambria" w:eastAsia="Cambria" w:hAnsi="Cambria"/>
+          <w:b w:val="0"/>
+          <w:i w:val="0"/>
+          <w:smallCaps w:val="0"/>
+          <w:strike w:val="0"/>
+          <w:color w:val="00000a"/>
+          <w:sz w:val="24"/>
+          <w:szCs w:val="24"/>
+          <w:u w:val="none"/>
+          <w:shd w:fill="auto" w:val="clear"/>
+          <w:vertAlign w:val="baseline"/>
+          <w:rtl w:val="0"/>
+        </w:rPr>
+        <w:t xml:space="preserve">n Matlab command line to start the stimulus presentation function. The following prompt will appear: </w:t>
       </w:r>
     </w:p>
     <w:p>
@@ -2534,28 +2856,31 @@
       </w:pPr>
       <w:r>
         <w:rPr>
-          <w:rFonts w:ascii="Cambria" w:cs="Cambria" w:eastAsia="Cambria" w:hAnsi="Cambria"/>
-          <w:b w:val="0"/>
-          <w:i w:val="0"/>
-          <w:smallCaps w:val="0"/>
-          <w:strike w:val="0"/>
-          <w:color w:val="00000a"/>
-          <w:sz w:val="24"/>
-          <w:szCs w:val="24"/>
-          <w:u w:val="none"/>
-          <w:shd w:fill="auto" w:val="clear"/>
-          <w:vertAlign w:val="baseline"/>
-        </w:rPr>
+          <w:rtl w:val="0"/>
+        </w:rPr>
+      </w:r>
+    </w:p>
+    <w:p>
+      <w:pPr>
+        <w:numPr>
+          <w:ilvl w:val="0"/>
+          <w:numId w:val="1"/>
+        </w:numPr>
+        <w:ind w:left="720" w:hanging="360"/>
+        <w:jc w:val="left"/>
+      </w:pPr>
+      <w:r>
+        <w:rPr/>
         <w:drawing>
-          <wp:inline distB="0" distT="0" distL="0" distR="0">
-            <wp:extent cx="3105150" cy="2162175"/>
+          <wp:inline distB="114300" distT="114300" distL="114300" distR="114300">
+            <wp:extent cx="3581400" cy="4562475"/>
             <wp:effectExtent b="0" l="0" r="0" t="0"/>
-            <wp:docPr id="21" name="image6.png"/>
+            <wp:docPr id="21" name="image9.png"/>
             <a:graphic>
               <a:graphicData uri="http://schemas.openxmlformats.org/drawingml/2006/picture">
                 <pic:pic>
                   <pic:nvPicPr>
-                    <pic:cNvPr id="0" name="image6.png"/>
+                    <pic:cNvPr id="0" name="image9.png"/>
                     <pic:cNvPicPr preferRelativeResize="0"/>
                   </pic:nvPicPr>
                   <pic:blipFill>
@@ -2568,7 +2893,7 @@
                   <pic:spPr>
                     <a:xfrm>
                       <a:off x="0" y="0"/>
-                      <a:ext cx="3105150" cy="2162175"/>
+                      <a:ext cx="3581400" cy="4562475"/>
                     </a:xfrm>
                     <a:prstGeom prst="rect"/>
                     <a:ln/>
@@ -2746,7 +3071,7 @@
           <w:vertAlign w:val="baseline"/>
           <w:rtl w:val="0"/>
         </w:rPr>
-        <w:t xml:space="preserve">Instruct the subject: “Say each word as a single syllable” (avoid epenthesis)</w:t>
+        <w:t xml:space="preserve">Mute your (the experiment’s) microphone (on Windows, press Alt + A)</w:t>
       </w:r>
     </w:p>
     <w:p>
@@ -2786,7 +3111,7 @@
           <w:vertAlign w:val="baseline"/>
           <w:rtl w:val="0"/>
         </w:rPr>
-        <w:t xml:space="preserve">Mute your (the experiment’s) microphone (on Windows, press Alt + A)</w:t>
+        <w:t xml:space="preserve">Proceed through the 10 Familiarization trials. For each trial, press Spacebar to proceed once the subject has completed saying the syllable. You should be able to hear both the stimulus audio and the subject’s microphone. </w:t>
       </w:r>
     </w:p>
     <w:p>
@@ -2826,7 +3151,7 @@
           <w:vertAlign w:val="baseline"/>
           <w:rtl w:val="0"/>
         </w:rPr>
-        <w:t xml:space="preserve">Proceed through the 10 Familiarization trials. For each trial, press Spacebar to proceed once the subject has completed saying the syllable. You should be able to hear both the stimulus audio and the subject’s microphone. </w:t>
+        <w:t xml:space="preserve">Unmute the experiment’s microphone </w:t>
       </w:r>
     </w:p>
     <w:p>
@@ -2866,16 +3191,16 @@
           <w:vertAlign w:val="baseline"/>
           <w:rtl w:val="0"/>
         </w:rPr>
-        <w:t xml:space="preserve">Unmute the experiment’s microphone </w:t>
-      </w:r>
-    </w:p>
-    <w:p>
-      <w:pPr>
-        <w:keepNext w:val="0"/>
-        <w:keepLines w:val="0"/>
-        <w:widowControl w:val="1"/>
-        <w:numPr>
-          <w:ilvl w:val="0"/>
+        <w:t xml:space="preserve">If the subject had difficulties during Familiarization (such as too much epenthesis, not waiting until the GO cue, or not following STOP cues), instruct them on how to improve and rerun Familiarization until they perform the task correctly</w:t>
+      </w:r>
+    </w:p>
+    <w:p>
+      <w:pPr>
+        <w:keepNext w:val="0"/>
+        <w:keepLines w:val="0"/>
+        <w:widowControl w:val="1"/>
+        <w:numPr>
+          <w:ilvl w:val="1"/>
           <w:numId w:val="2"/>
         </w:numPr>
         <w:pBdr>
@@ -2887,26 +3212,17 @@
         </w:pBdr>
         <w:shd w:fill="auto" w:val="clear"/>
         <w:spacing w:after="0" w:before="0" w:line="240" w:lineRule="auto"/>
-        <w:ind w:left="720" w:right="0" w:hanging="360"/>
-        <w:jc w:val="left"/>
-        <w:rPr/>
-      </w:pPr>
-      <w:r>
-        <w:rPr>
-          <w:rFonts w:ascii="Cambria" w:cs="Cambria" w:eastAsia="Cambria" w:hAnsi="Cambria"/>
-          <w:b w:val="0"/>
-          <w:i w:val="0"/>
-          <w:smallCaps w:val="0"/>
-          <w:strike w:val="0"/>
-          <w:color w:val="00000a"/>
-          <w:sz w:val="24"/>
-          <w:szCs w:val="24"/>
-          <w:u w:val="none"/>
-          <w:shd w:fill="auto" w:val="clear"/>
-          <w:vertAlign w:val="baseline"/>
-          <w:rtl w:val="0"/>
-        </w:rPr>
-        <w:t xml:space="preserve">If the subject had difficulties during Familiarization (such as too much epenthesis, not waiting until the GO cue, or not following STOP cues), rerun Familiarization until they perform the task correctly</w:t>
+        <w:ind w:left="1440" w:right="0" w:hanging="360"/>
+        <w:jc w:val="left"/>
+        <w:rPr>
+          <w:u w:val="none"/>
+        </w:rPr>
+      </w:pPr>
+      <w:r>
+        <w:rPr>
+          <w:rtl w:val="0"/>
+        </w:rPr>
+        <w:t xml:space="preserve">For epenthesis, instruct the subject to say each sound as a single syllable</w:t>
       </w:r>
     </w:p>
     <w:p>
@@ -3132,12 +3448,12 @@
           <wp:inline distB="0" distT="0" distL="0" distR="0">
             <wp:extent cx="3200400" cy="1419225"/>
             <wp:effectExtent b="0" l="0" r="0" t="0"/>
-            <wp:docPr id="20" name="image4.png"/>
+            <wp:docPr id="20" name="image5.png"/>
             <a:graphic>
               <a:graphicData uri="http://schemas.openxmlformats.org/drawingml/2006/picture">
                 <pic:pic>
                   <pic:nvPicPr>
-                    <pic:cNvPr id="0" name="image4.png"/>
+                    <pic:cNvPr id="0" name="image5.png"/>
                     <pic:cNvPicPr preferRelativeResize="0"/>
                   </pic:nvPicPr>
                   <pic:blipFill>
@@ -4259,7 +4575,7 @@
 
 <file path=customXML/item1.xml><?xml version="1.0" encoding="utf-8"?>
 <go:gDocsCustomXmlDataStorage xmlns:go="http://customooxmlschemas.google.com/" xmlns:r="http://schemas.openxmlformats.org/officeDocument/2006/relationships">
-  <go:docsCustomData xmlns:go="http://customooxmlschemas.google.com/" roundtripDataSignature="AMtx7mgK0u52S2jnuVpMD0SwaNXRbxvaew==">AMUW2mUALSqjiBwchf/88DcWMPvBkAaz7mHvICh8uwkVgFjBcS1L1LOiV0jqF37yP+u0oUyuIJJniV+MXvVshEpglKW9RbHxCyYI9tX+C1kwp8q8AAyESwTOR9bzkaI9Ld4ZmcdzZZmoH2evR5BwvzKJGgKkwqRZwQ==</go:docsCustomData>
+  <go:docsCustomData xmlns:go="http://customooxmlschemas.google.com/" roundtripDataSignature="AMtx7mgABMjIWCAg8l/+iExnYGqYnMVjzg==">AMUW2mVgGM3VVCKIR1pG7hE5Kd8P47bLJZ3iv6RpM7G6MOwdG4ogCIBSm/J45klNSSsk2UCFAch6raWNPxLijG4ztUmJYzD8NIgyL4hk6X4BScgIlgMeQG531ZNBG9Gqk49ZHX9Rd3hZxUyd3bOm9PqnBC4Oh+5ZtrwxuCjePiCgY01r9eofAS8=</go:docsCustomData>
 </go:gDocsCustomXmlDataStorage>
 </file>
 

</xml_diff>